<commit_message>
Update Calc 1 3.5 Blended worksheet solutions
Co-Authored-By: Claude Sonnet 5 <noreply@anthropic.com>
</commit_message>
<xml_diff>
--- a/Course Materials/Calc 1/Blended Sessions/Unit 2/3.5 Calculating Derivatives & Definition of the Derivative_Solutions.docx
+++ b/Course Materials/Calc 1/Blended Sessions/Unit 2/3.5 Calculating Derivatives & Definition of the Derivative_Solutions.docx
@@ -128,10 +128,10 @@
             <v:path o:extrusionok="f" gradientshapeok="t" o:connecttype="rect"/>
             <o:lock v:ext="edit" aspectratio="t"/>
           </v:shapetype>
-          <v:shape id="_x0000_i1025" type="#_x0000_t75" style="width:54.7pt;height:20.25pt" o:ole="">
+          <v:shape id="_x0000_i1025" type="#_x0000_t75" style="width:54.6pt;height:20.4pt" o:ole="">
             <v:imagedata r:id="rId7" o:title=""/>
           </v:shape>
-          <o:OLEObject Type="Embed" ProgID="Equation.DSMT4" ShapeID="_x0000_i1025" DrawAspect="Content" ObjectID="_1844968360" r:id="rId8"/>
+          <o:OLEObject Type="Embed" ProgID="Equation.DSMT4" ShapeID="_x0000_i1025" DrawAspect="Content" ObjectID="_1852223155" r:id="rId8"/>
         </w:object>
       </w:r>
       <w:r>
@@ -169,10 +169,10 @@
           <w:position w:val="-14"/>
         </w:rPr>
         <w:object w:dxaOrig="1100" w:dyaOrig="400" w14:anchorId="52C45F9D">
-          <v:shape id="_x0000_i1026" type="#_x0000_t75" style="width:54.7pt;height:20.25pt" o:ole="">
+          <v:shape id="_x0000_i1026" type="#_x0000_t75" style="width:54.6pt;height:20.4pt" o:ole="">
             <v:imagedata r:id="rId7" o:title=""/>
           </v:shape>
-          <o:OLEObject Type="Embed" ProgID="Equation.DSMT4" ShapeID="_x0000_i1026" DrawAspect="Content" ObjectID="_1844968361" r:id="rId9"/>
+          <o:OLEObject Type="Embed" ProgID="Equation.DSMT4" ShapeID="_x0000_i1026" DrawAspect="Content" ObjectID="_1852223156" r:id="rId9"/>
         </w:object>
       </w:r>
       <w:r>
@@ -208,10 +208,10 @@
           <w:szCs w:val="24"/>
         </w:rPr>
         <w:object w:dxaOrig="2020" w:dyaOrig="700" w14:anchorId="15423291">
-          <v:shape id="_x0000_i1027" type="#_x0000_t75" style="width:101.2pt;height:35.25pt" o:ole="">
+          <v:shape id="_x0000_i1027" type="#_x0000_t75" style="width:101.4pt;height:35.4pt" o:ole="">
             <v:imagedata r:id="rId10" o:title=""/>
           </v:shape>
-          <o:OLEObject Type="Embed" ProgID="Equation.DSMT4" ShapeID="_x0000_i1027" DrawAspect="Content" ObjectID="_1844968362" r:id="rId11"/>
+          <o:OLEObject Type="Embed" ProgID="Equation.DSMT4" ShapeID="_x0000_i1027" DrawAspect="Content" ObjectID="_1852223157" r:id="rId11"/>
         </w:object>
       </w:r>
       <w:r>
@@ -248,10 +248,10 @@
           <w:szCs w:val="24"/>
         </w:rPr>
         <w:object w:dxaOrig="6840" w:dyaOrig="2140" w14:anchorId="6B298696">
-          <v:shape id="_x0000_i1028" type="#_x0000_t75" style="width:342.7pt;height:107.2pt" o:ole="">
+          <v:shape id="_x0000_i1028" type="#_x0000_t75" style="width:342.6pt;height:107.4pt" o:ole="">
             <v:imagedata r:id="rId12" o:title=""/>
           </v:shape>
-          <o:OLEObject Type="Embed" ProgID="Equation.DSMT4" ShapeID="_x0000_i1028" DrawAspect="Content" ObjectID="_1844968363" r:id="rId13"/>
+          <o:OLEObject Type="Embed" ProgID="Equation.DSMT4" ShapeID="_x0000_i1028" DrawAspect="Content" ObjectID="_1852223158" r:id="rId13"/>
         </w:object>
       </w:r>
     </w:p>
@@ -461,10 +461,10 @@
           <w:szCs w:val="24"/>
         </w:rPr>
         <w:object w:dxaOrig="1800" w:dyaOrig="740" w14:anchorId="125CE02B">
-          <v:shape id="_x0000_i1029" type="#_x0000_t75" style="width:90pt;height:36.75pt" o:ole="">
+          <v:shape id="_x0000_i1029" type="#_x0000_t75" style="width:90pt;height:36.6pt" o:ole="">
             <v:imagedata r:id="rId14" o:title=""/>
           </v:shape>
-          <o:OLEObject Type="Embed" ProgID="Equation.DSMT4" ShapeID="_x0000_i1029" DrawAspect="Content" ObjectID="_1844968364" r:id="rId15"/>
+          <o:OLEObject Type="Embed" ProgID="Equation.DSMT4" ShapeID="_x0000_i1029" DrawAspect="Content" ObjectID="_1852223159" r:id="rId15"/>
         </w:object>
       </w:r>
       <w:r>
@@ -479,10 +479,10 @@
           <w:szCs w:val="24"/>
         </w:rPr>
         <w:object w:dxaOrig="1860" w:dyaOrig="700" w14:anchorId="2CEB845F">
-          <v:shape id="_x0000_i1030" type="#_x0000_t75" style="width:93pt;height:35.25pt" o:ole="">
+          <v:shape id="_x0000_i1030" type="#_x0000_t75" style="width:93pt;height:35.4pt" o:ole="">
             <v:imagedata r:id="rId16" o:title=""/>
           </v:shape>
-          <o:OLEObject Type="Embed" ProgID="Equation.DSMT4" ShapeID="_x0000_i1030" DrawAspect="Content" ObjectID="_1844968365" r:id="rId17"/>
+          <o:OLEObject Type="Embed" ProgID="Equation.DSMT4" ShapeID="_x0000_i1030" DrawAspect="Content" ObjectID="_1852223160" r:id="rId17"/>
         </w:object>
       </w:r>
       <w:r>
@@ -520,10 +520,10 @@
           <w:szCs w:val="24"/>
         </w:rPr>
         <w:object w:dxaOrig="10140" w:dyaOrig="840" w14:anchorId="79665B98">
-          <v:shape id="_x0000_i1031" type="#_x0000_t75" style="width:506.5pt;height:42pt" o:ole="">
+          <v:shape id="_x0000_i1031" type="#_x0000_t75" style="width:506.4pt;height:42pt" o:ole="">
             <v:imagedata r:id="rId18" o:title=""/>
           </v:shape>
-          <o:OLEObject Type="Embed" ProgID="Equation.DSMT4" ShapeID="_x0000_i1031" DrawAspect="Content" ObjectID="_1844968366" r:id="rId19"/>
+          <o:OLEObject Type="Embed" ProgID="Equation.DSMT4" ShapeID="_x0000_i1031" DrawAspect="Content" ObjectID="_1852223161" r:id="rId19"/>
         </w:object>
       </w:r>
     </w:p>
@@ -633,10 +633,10 @@
           <w:szCs w:val="24"/>
         </w:rPr>
         <w:object w:dxaOrig="1420" w:dyaOrig="740" w14:anchorId="745472FA">
-          <v:shape id="_x0000_i1032" type="#_x0000_t75" style="width:71.3pt;height:36.75pt" o:ole="">
+          <v:shape id="_x0000_i1032" type="#_x0000_t75" style="width:71.4pt;height:36.6pt" o:ole="">
             <v:imagedata r:id="rId20" o:title=""/>
           </v:shape>
-          <o:OLEObject Type="Embed" ProgID="Equation.DSMT4" ShapeID="_x0000_i1032" DrawAspect="Content" ObjectID="_1844968367" r:id="rId21"/>
+          <o:OLEObject Type="Embed" ProgID="Equation.DSMT4" ShapeID="_x0000_i1032" DrawAspect="Content" ObjectID="_1852223162" r:id="rId21"/>
         </w:object>
       </w:r>
       <w:r>
@@ -651,10 +651,10 @@
           <w:szCs w:val="24"/>
         </w:rPr>
         <w:object w:dxaOrig="620" w:dyaOrig="620" w14:anchorId="36B965BE">
-          <v:shape id="_x0000_i1033" type="#_x0000_t75" style="width:30.75pt;height:30.75pt" o:ole="">
+          <v:shape id="_x0000_i1033" type="#_x0000_t75" style="width:30.6pt;height:30.6pt" o:ole="">
             <v:imagedata r:id="rId22" o:title=""/>
           </v:shape>
-          <o:OLEObject Type="Embed" ProgID="Equation.DSMT4" ShapeID="_x0000_i1033" DrawAspect="Content" ObjectID="_1844968368" r:id="rId23"/>
+          <o:OLEObject Type="Embed" ProgID="Equation.DSMT4" ShapeID="_x0000_i1033" DrawAspect="Content" ObjectID="_1852223163" r:id="rId23"/>
         </w:object>
       </w:r>
       <w:r>
@@ -690,10 +690,10 @@
           <w:szCs w:val="24"/>
         </w:rPr>
         <w:object w:dxaOrig="4060" w:dyaOrig="840" w14:anchorId="68441D6B">
-          <v:shape id="_x0000_i1034" type="#_x0000_t75" style="width:203.2pt;height:42pt" o:ole="">
+          <v:shape id="_x0000_i1034" type="#_x0000_t75" style="width:203.4pt;height:42pt" o:ole="">
             <v:imagedata r:id="rId24" o:title=""/>
           </v:shape>
-          <o:OLEObject Type="Embed" ProgID="Equation.DSMT4" ShapeID="_x0000_i1034" DrawAspect="Content" ObjectID="_1844968369" r:id="rId25"/>
+          <o:OLEObject Type="Embed" ProgID="Equation.DSMT4" ShapeID="_x0000_i1034" DrawAspect="Content" ObjectID="_1852223164" r:id="rId25"/>
         </w:object>
       </w:r>
       <w:r>
@@ -711,7 +711,7 @@
           <v:shape id="_x0000_i1035" type="#_x0000_t75" style="width:390pt;height:1in" o:ole="">
             <v:imagedata r:id="rId26" o:title=""/>
           </v:shape>
-          <o:OLEObject Type="Embed" ProgID="Equation.DSMT4" ShapeID="_x0000_i1035" DrawAspect="Content" ObjectID="_1844968370" r:id="rId27"/>
+          <o:OLEObject Type="Embed" ProgID="Equation.DSMT4" ShapeID="_x0000_i1035" DrawAspect="Content" ObjectID="_1852223165" r:id="rId27"/>
         </w:object>
       </w:r>
       <w:r>
@@ -734,10 +734,10 @@
           <w:szCs w:val="24"/>
         </w:rPr>
         <w:object w:dxaOrig="3040" w:dyaOrig="1320" w14:anchorId="3DE3F269">
-          <v:shape id="_x0000_i1036" type="#_x0000_t75" style="width:152.3pt;height:66pt" o:ole="">
+          <v:shape id="_x0000_i1036" type="#_x0000_t75" style="width:152.4pt;height:66pt" o:ole="">
             <v:imagedata r:id="rId28" o:title=""/>
           </v:shape>
-          <o:OLEObject Type="Embed" ProgID="Equation.DSMT4" ShapeID="_x0000_i1036" DrawAspect="Content" ObjectID="_1844968371" r:id="rId29"/>
+          <o:OLEObject Type="Embed" ProgID="Equation.DSMT4" ShapeID="_x0000_i1036" DrawAspect="Content" ObjectID="_1852223166" r:id="rId29"/>
         </w:object>
       </w:r>
     </w:p>
@@ -774,10 +774,10 @@
           <w:szCs w:val="24"/>
         </w:rPr>
         <w:object w:dxaOrig="740" w:dyaOrig="279" w14:anchorId="1B5D0D6F">
-          <v:shape id="_x0000_i1037" type="#_x0000_t75" style="width:36.75pt;height:14.25pt" o:ole="">
+          <v:shape id="_x0000_i1037" type="#_x0000_t75" style="width:36.6pt;height:14.4pt" o:ole="">
             <v:imagedata r:id="rId30" o:title=""/>
           </v:shape>
-          <o:OLEObject Type="Embed" ProgID="Equation.DSMT4" ShapeID="_x0000_i1037" DrawAspect="Content" ObjectID="_1844968372" r:id="rId31"/>
+          <o:OLEObject Type="Embed" ProgID="Equation.DSMT4" ShapeID="_x0000_i1037" DrawAspect="Content" ObjectID="_1852223167" r:id="rId31"/>
         </w:object>
       </w:r>
     </w:p>
@@ -801,10 +801,10 @@
           <w:szCs w:val="24"/>
         </w:rPr>
         <w:object w:dxaOrig="780" w:dyaOrig="680" w14:anchorId="12993CF1">
-          <v:shape id="_x0000_i1038" type="#_x0000_t75" style="width:39pt;height:33.75pt" o:ole="">
+          <v:shape id="_x0000_i1038" type="#_x0000_t75" style="width:39pt;height:33.6pt" o:ole="">
             <v:imagedata r:id="rId32" o:title=""/>
           </v:shape>
-          <o:OLEObject Type="Embed" ProgID="Equation.DSMT4" ShapeID="_x0000_i1038" DrawAspect="Content" ObjectID="_1844968373" r:id="rId33"/>
+          <o:OLEObject Type="Embed" ProgID="Equation.DSMT4" ShapeID="_x0000_i1038" DrawAspect="Content" ObjectID="_1852223168" r:id="rId33"/>
         </w:object>
       </w:r>
     </w:p>
@@ -827,10 +827,10 @@
           <w:szCs w:val="24"/>
         </w:rPr>
         <w:object w:dxaOrig="3879" w:dyaOrig="680" w14:anchorId="33729AED">
-          <v:shape id="_x0000_i1039" type="#_x0000_t75" style="width:194.35pt;height:33.75pt" o:ole="">
+          <v:shape id="_x0000_i1039" type="#_x0000_t75" style="width:194.4pt;height:33.6pt" o:ole="">
             <v:imagedata r:id="rId34" o:title=""/>
           </v:shape>
-          <o:OLEObject Type="Embed" ProgID="Equation.DSMT4" ShapeID="_x0000_i1039" DrawAspect="Content" ObjectID="_1844968374" r:id="rId35"/>
+          <o:OLEObject Type="Embed" ProgID="Equation.DSMT4" ShapeID="_x0000_i1039" DrawAspect="Content" ObjectID="_1852223169" r:id="rId35"/>
         </w:object>
       </w:r>
     </w:p>
@@ -905,6 +905,7 @@
         <w:rPr>
           <w:szCs w:val="24"/>
         </w:rPr>
+        <w:lastRenderedPageBreak/>
         <w:t xml:space="preserve">Suppose that </w:t>
       </w:r>
       <w:r>
@@ -913,10 +914,10 @@
           <w:szCs w:val="24"/>
         </w:rPr>
         <w:object w:dxaOrig="1460" w:dyaOrig="400" w14:anchorId="4934148E">
-          <v:shape id="_x0000_i1040" type="#_x0000_t75" style="width:72.8pt;height:20.25pt" o:ole="">
+          <v:shape id="_x0000_i1040" type="#_x0000_t75" style="width:72.6pt;height:20.4pt" o:ole="">
             <v:imagedata r:id="rId36" o:title=""/>
           </v:shape>
-          <o:OLEObject Type="Embed" ProgID="Equation.DSMT4" ShapeID="_x0000_i1040" DrawAspect="Content" ObjectID="_1844968375" r:id="rId37"/>
+          <o:OLEObject Type="Embed" ProgID="Equation.DSMT4" ShapeID="_x0000_i1040" DrawAspect="Content" ObjectID="_1852223170" r:id="rId37"/>
         </w:object>
       </w:r>
       <w:r>
@@ -945,10 +946,10 @@
           <w:szCs w:val="24"/>
         </w:rPr>
         <w:object w:dxaOrig="1020" w:dyaOrig="400" w14:anchorId="50E4B966">
-          <v:shape id="_x0000_i1041" type="#_x0000_t75" style="width:51pt;height:20.25pt" o:ole="">
+          <v:shape id="_x0000_i1041" type="#_x0000_t75" style="width:51pt;height:20.4pt" o:ole="">
             <v:imagedata r:id="rId38" o:title=""/>
           </v:shape>
-          <o:OLEObject Type="Embed" ProgID="Equation.DSMT4" ShapeID="_x0000_i1041" DrawAspect="Content" ObjectID="_1844968376" r:id="rId39"/>
+          <o:OLEObject Type="Embed" ProgID="Equation.DSMT4" ShapeID="_x0000_i1041" DrawAspect="Content" ObjectID="_1852223171" r:id="rId39"/>
         </w:object>
       </w:r>
       <w:r>
@@ -969,10 +970,10 @@
           <w:szCs w:val="24"/>
         </w:rPr>
         <w:object w:dxaOrig="700" w:dyaOrig="400" w14:anchorId="2459B252">
-          <v:shape id="_x0000_i1042" type="#_x0000_t75" style="width:35.25pt;height:20.25pt" o:ole="">
+          <v:shape id="_x0000_i1042" type="#_x0000_t75" style="width:35.4pt;height:20.4pt" o:ole="">
             <v:imagedata r:id="rId40" o:title=""/>
           </v:shape>
-          <o:OLEObject Type="Embed" ProgID="Equation.DSMT4" ShapeID="_x0000_i1042" DrawAspect="Content" ObjectID="_1844968377" r:id="rId41"/>
+          <o:OLEObject Type="Embed" ProgID="Equation.DSMT4" ShapeID="_x0000_i1042" DrawAspect="Content" ObjectID="_1852223172" r:id="rId41"/>
         </w:object>
       </w:r>
       <w:r>
@@ -1008,10 +1009,10 @@
           <w:szCs w:val="24"/>
         </w:rPr>
         <w:object w:dxaOrig="639" w:dyaOrig="400" w14:anchorId="35B82F13">
-          <v:shape id="_x0000_i1043" type="#_x0000_t75" style="width:32.25pt;height:20.25pt" o:ole="">
+          <v:shape id="_x0000_i1043" type="#_x0000_t75" style="width:32.4pt;height:20.4pt" o:ole="">
             <v:imagedata r:id="rId42" o:title=""/>
           </v:shape>
-          <o:OLEObject Type="Embed" ProgID="Equation.DSMT4" ShapeID="_x0000_i1043" DrawAspect="Content" ObjectID="_1844968378" r:id="rId43"/>
+          <o:OLEObject Type="Embed" ProgID="Equation.DSMT4" ShapeID="_x0000_i1043" DrawAspect="Content" ObjectID="_1852223173" r:id="rId43"/>
         </w:object>
       </w:r>
       <w:r>
@@ -1026,10 +1027,10 @@
           <w:szCs w:val="24"/>
         </w:rPr>
         <w:object w:dxaOrig="660" w:dyaOrig="400" w14:anchorId="11D2DAD7">
-          <v:shape id="_x0000_i1044" type="#_x0000_t75" style="width:33pt;height:20.25pt" o:ole="">
+          <v:shape id="_x0000_i1044" type="#_x0000_t75" style="width:33pt;height:20.4pt" o:ole="">
             <v:imagedata r:id="rId44" o:title=""/>
           </v:shape>
-          <o:OLEObject Type="Embed" ProgID="Equation.DSMT4" ShapeID="_x0000_i1044" DrawAspect="Content" ObjectID="_1844968379" r:id="rId45"/>
+          <o:OLEObject Type="Embed" ProgID="Equation.DSMT4" ShapeID="_x0000_i1044" DrawAspect="Content" ObjectID="_1852223174" r:id="rId45"/>
         </w:object>
       </w:r>
       <w:r>
@@ -1072,10 +1073,10 @@
           <w:szCs w:val="24"/>
         </w:rPr>
         <w:object w:dxaOrig="2340" w:dyaOrig="400" w14:anchorId="33799610">
-          <v:shape id="_x0000_i1045" type="#_x0000_t75" style="width:117pt;height:20.25pt" o:ole="">
+          <v:shape id="_x0000_i1045" type="#_x0000_t75" style="width:117pt;height:20.4pt" o:ole="">
             <v:imagedata r:id="rId46" o:title=""/>
           </v:shape>
-          <o:OLEObject Type="Embed" ProgID="Equation.DSMT4" ShapeID="_x0000_i1045" DrawAspect="Content" ObjectID="_1844968380" r:id="rId47"/>
+          <o:OLEObject Type="Embed" ProgID="Equation.DSMT4" ShapeID="_x0000_i1045" DrawAspect="Content" ObjectID="_1852223175" r:id="rId47"/>
         </w:object>
       </w:r>
       <w:r>
@@ -1098,10 +1099,10 @@
           <w:szCs w:val="24"/>
         </w:rPr>
         <w:object w:dxaOrig="7100" w:dyaOrig="400" w14:anchorId="49650BBB">
-          <v:shape id="_x0000_i1046" type="#_x0000_t75" style="width:354.65pt;height:20.25pt" o:ole="">
+          <v:shape id="_x0000_i1080" type="#_x0000_t75" style="width:354.6pt;height:20.4pt" o:ole="">
             <v:imagedata r:id="rId48" o:title=""/>
           </v:shape>
-          <o:OLEObject Type="Embed" ProgID="Equation.DSMT4" ShapeID="_x0000_i1046" DrawAspect="Content" ObjectID="_1844968381" r:id="rId49"/>
+          <o:OLEObject Type="Embed" ProgID="Equation.DSMT4" ShapeID="_x0000_i1080" DrawAspect="Content" ObjectID="_1852223176" r:id="rId49"/>
         </w:object>
       </w:r>
     </w:p>
@@ -1131,10 +1132,10 @@
           <w:szCs w:val="24"/>
         </w:rPr>
         <w:object w:dxaOrig="1020" w:dyaOrig="400" w14:anchorId="54ABA909">
-          <v:shape id="_x0000_i1047" type="#_x0000_t75" style="width:51pt;height:20.25pt" o:ole="">
+          <v:shape id="_x0000_i1047" type="#_x0000_t75" style="width:51pt;height:20.4pt" o:ole="">
             <v:imagedata r:id="rId50" o:title=""/>
           </v:shape>
-          <o:OLEObject Type="Embed" ProgID="Equation.DSMT4" ShapeID="_x0000_i1047" DrawAspect="Content" ObjectID="_1844968382" r:id="rId51"/>
+          <o:OLEObject Type="Embed" ProgID="Equation.DSMT4" ShapeID="_x0000_i1047" DrawAspect="Content" ObjectID="_1852223177" r:id="rId51"/>
         </w:object>
       </w:r>
       <w:r>
@@ -1157,10 +1158,10 @@
           <w:szCs w:val="24"/>
         </w:rPr>
         <w:object w:dxaOrig="6380" w:dyaOrig="440" w14:anchorId="07198758">
-          <v:shape id="_x0000_i1048" type="#_x0000_t75" style="width:318.7pt;height:21.75pt" o:ole="">
+          <v:shape id="_x0000_i1082" type="#_x0000_t75" style="width:318.6pt;height:21.6pt" o:ole="">
             <v:imagedata r:id="rId52" o:title=""/>
           </v:shape>
-          <o:OLEObject Type="Embed" ProgID="Equation.DSMT4" ShapeID="_x0000_i1048" DrawAspect="Content" ObjectID="_1844968383" r:id="rId53"/>
+          <o:OLEObject Type="Embed" ProgID="Equation.DSMT4" ShapeID="_x0000_i1082" DrawAspect="Content" ObjectID="_1852223178" r:id="rId53"/>
         </w:object>
       </w:r>
     </w:p>
@@ -1194,10 +1195,10 @@
           <w:szCs w:val="24"/>
         </w:rPr>
         <w:object w:dxaOrig="3580" w:dyaOrig="400" w14:anchorId="5422992E">
-          <v:shape id="_x0000_i1049" type="#_x0000_t75" style="width:178.45pt;height:20.25pt" o:ole="">
+          <v:shape id="_x0000_i1085" type="#_x0000_t75" style="width:178.2pt;height:20.4pt" o:ole="">
             <v:imagedata r:id="rId54" o:title=""/>
           </v:shape>
-          <o:OLEObject Type="Embed" ProgID="Equation.DSMT4" ShapeID="_x0000_i1049" DrawAspect="Content" ObjectID="_1844968384" r:id="rId55"/>
+          <o:OLEObject Type="Embed" ProgID="Equation.DSMT4" ShapeID="_x0000_i1085" DrawAspect="Content" ObjectID="_1852223179" r:id="rId55"/>
         </w:object>
       </w:r>
     </w:p>
@@ -1221,14 +1222,14 @@
       </w:r>
       <w:r>
         <w:rPr>
-          <w:position w:val="-14"/>
-          <w:szCs w:val="24"/>
-        </w:rPr>
-        <w:object w:dxaOrig="720" w:dyaOrig="400" w14:anchorId="3941C8D6">
-          <v:shape id="_x0000_i1050" type="#_x0000_t75" style="width:36pt;height:20.25pt" o:ole="">
+          <w:position w:val="-32"/>
+          <w:szCs w:val="24"/>
+        </w:rPr>
+        <w:object w:dxaOrig="1620" w:dyaOrig="700" w14:anchorId="3941C8D6">
+          <v:shape id="_x0000_i1089" type="#_x0000_t75" style="width:81pt;height:35.4pt" o:ole="">
             <v:imagedata r:id="rId56" o:title=""/>
           </v:shape>
-          <o:OLEObject Type="Embed" ProgID="Equation.DSMT4" ShapeID="_x0000_i1050" DrawAspect="Content" ObjectID="_1844968385" r:id="rId57"/>
+          <o:OLEObject Type="Embed" ProgID="Equation.DSMT4" ShapeID="_x0000_i1089" DrawAspect="Content" ObjectID="_1852223180" r:id="rId57"/>
         </w:object>
       </w:r>
       <w:r>
@@ -1240,47 +1241,88 @@
     </w:p>
     <w:p>
       <w:pPr>
-        <w:rPr>
-          <w:szCs w:val="24"/>
-        </w:rPr>
-      </w:pPr>
-      <w:r>
-        <w:rPr>
-          <w:szCs w:val="24"/>
-        </w:rPr>
-        <w:tab/>
-      </w:r>
-      <w:r>
-        <w:rPr>
-          <w:szCs w:val="24"/>
-        </w:rPr>
-        <w:tab/>
-      </w:r>
-      <w:r>
-        <w:rPr>
-          <w:position w:val="-24"/>
-          <w:szCs w:val="24"/>
-        </w:rPr>
-        <w:object w:dxaOrig="9260" w:dyaOrig="620" w14:anchorId="33B50D62">
-          <v:shape id="_x0000_i1051" type="#_x0000_t75" style="width:462.55pt;height:30.75pt" o:ole="">
+        <w:ind w:left="1440"/>
+        <w:rPr>
+          <w:szCs w:val="24"/>
+        </w:rPr>
+      </w:pPr>
+      <w:r>
+        <w:rPr>
+          <w:position w:val="-14"/>
+          <w:szCs w:val="24"/>
+        </w:rPr>
+        <w:object w:dxaOrig="6640" w:dyaOrig="400" w14:anchorId="33B50D62">
+          <v:shape id="_x0000_i1091" type="#_x0000_t75" style="width:331.8pt;height:19.8pt" o:ole="">
             <v:imagedata r:id="rId58" o:title=""/>
           </v:shape>
-          <o:OLEObject Type="Embed" ProgID="Equation.DSMT4" ShapeID="_x0000_i1051" DrawAspect="Content" ObjectID="_1844968386" r:id="rId59"/>
+          <o:OLEObject Type="Embed" ProgID="Equation.DSMT4" ShapeID="_x0000_i1091" DrawAspect="Content" ObjectID="_1852223181" r:id="rId59"/>
         </w:object>
       </w:r>
       <w:r>
         <w:rPr>
           <w:szCs w:val="24"/>
         </w:rPr>
+        <w:t>.  This is also never possible.</w:t>
+      </w:r>
+    </w:p>
+    <w:p>
+      <w:pPr>
+        <w:rPr>
+          <w:szCs w:val="24"/>
+        </w:rPr>
+      </w:pPr>
+    </w:p>
+    <w:p>
+      <w:pPr>
+        <w:rPr>
+          <w:szCs w:val="24"/>
+        </w:rPr>
+      </w:pPr>
+      <w:r>
+        <w:rPr>
+          <w:szCs w:val="24"/>
+        </w:rPr>
+        <w:tab/>
+        <w:t xml:space="preserve">Therefore, </w:t>
+      </w:r>
+      <w:r>
+        <w:rPr>
+          <w:szCs w:val="24"/>
+        </w:rPr>
+        <w:t xml:space="preserve">there are no values of </w:t>
+      </w:r>
+      <w:r>
+        <w:rPr>
+          <w:i/>
+          <w:iCs/>
+          <w:szCs w:val="24"/>
+        </w:rPr>
+        <w:t>x</w:t>
+      </w:r>
+      <w:r>
+        <w:rPr>
+          <w:szCs w:val="24"/>
+        </w:rPr>
+        <w:t xml:space="preserve"> that make horizontal tangent lines on </w:t>
+      </w:r>
+      <w:r>
+        <w:rPr>
+          <w:position w:val="-14"/>
+          <w:szCs w:val="24"/>
+        </w:rPr>
+        <w:object w:dxaOrig="1020" w:dyaOrig="400" w14:anchorId="17B8F00F">
+          <v:shape id="_x0000_i1092" type="#_x0000_t75" style="width:51pt;height:20.4pt" o:ole="">
+            <v:imagedata r:id="rId38" o:title=""/>
+          </v:shape>
+          <o:OLEObject Type="Embed" ProgID="Equation.DSMT4" ShapeID="_x0000_i1092" DrawAspect="Content" ObjectID="_1852223182" r:id="rId60"/>
+        </w:object>
+      </w:r>
+      <w:r>
+        <w:rPr>
+          <w:szCs w:val="24"/>
+        </w:rPr>
         <w:t>.</w:t>
       </w:r>
-    </w:p>
-    <w:p>
-      <w:pPr>
-        <w:rPr>
-          <w:szCs w:val="24"/>
-        </w:rPr>
-      </w:pPr>
     </w:p>
     <w:p>
       <w:pPr>
@@ -1319,10 +1361,10 @@
           <w:szCs w:val="24"/>
         </w:rPr>
         <w:object w:dxaOrig="2500" w:dyaOrig="960" w14:anchorId="2794D903">
-          <v:shape id="_x0000_i1052" type="#_x0000_t75" style="width:124.5pt;height:48pt" o:ole="">
-            <v:imagedata r:id="rId60" o:title=""/>
+          <v:shape id="_x0000_i1052" type="#_x0000_t75" style="width:124.8pt;height:48pt" o:ole="">
+            <v:imagedata r:id="rId61" o:title=""/>
           </v:shape>
-          <o:OLEObject Type="Embed" ProgID="Equation.DSMT4" ShapeID="_x0000_i1052" DrawAspect="Content" ObjectID="_1844968387" r:id="rId61"/>
+          <o:OLEObject Type="Embed" ProgID="Equation.DSMT4" ShapeID="_x0000_i1052" DrawAspect="Content" ObjectID="_1852223183" r:id="rId62"/>
         </w:object>
       </w:r>
       <w:r>
@@ -1358,10 +1400,10 @@
           <w:szCs w:val="24"/>
         </w:rPr>
         <w:object w:dxaOrig="1080" w:dyaOrig="400" w14:anchorId="234DAB2B">
-          <v:shape id="_x0000_i1053" type="#_x0000_t75" style="width:54pt;height:20.25pt" o:ole="">
-            <v:imagedata r:id="rId62" o:title=""/>
+          <v:shape id="_x0000_i1053" type="#_x0000_t75" style="width:54pt;height:20.4pt" o:ole="">
+            <v:imagedata r:id="rId63" o:title=""/>
           </v:shape>
-          <o:OLEObject Type="Embed" ProgID="Equation.DSMT4" ShapeID="_x0000_i1053" DrawAspect="Content" ObjectID="_1844968388" r:id="rId63"/>
+          <o:OLEObject Type="Embed" ProgID="Equation.DSMT4" ShapeID="_x0000_i1053" DrawAspect="Content" ObjectID="_1852223184" r:id="rId64"/>
         </w:object>
       </w:r>
       <w:r>
@@ -1376,10 +1418,10 @@
           <w:szCs w:val="24"/>
         </w:rPr>
         <w:object w:dxaOrig="260" w:dyaOrig="620" w14:anchorId="7AE635A2">
-          <v:shape id="_x0000_i1054" type="#_x0000_t75" style="width:12.75pt;height:30.75pt" o:ole="">
-            <v:imagedata r:id="rId64" o:title=""/>
+          <v:shape id="_x0000_i1054" type="#_x0000_t75" style="width:12.6pt;height:30.6pt" o:ole="">
+            <v:imagedata r:id="rId65" o:title=""/>
           </v:shape>
-          <o:OLEObject Type="Embed" ProgID="Equation.DSMT4" ShapeID="_x0000_i1054" DrawAspect="Content" ObjectID="_1844968389" r:id="rId65"/>
+          <o:OLEObject Type="Embed" ProgID="Equation.DSMT4" ShapeID="_x0000_i1054" DrawAspect="Content" ObjectID="_1852223185" r:id="rId66"/>
         </w:object>
       </w:r>
       <w:r>
@@ -1408,19 +1450,12 @@
           <w:szCs w:val="24"/>
         </w:rPr>
         <w:object w:dxaOrig="5620" w:dyaOrig="1120" w14:anchorId="472C14A1">
-          <v:shape id="_x0000_i1055" type="#_x0000_t75" style="width:281.3pt;height:56.2pt" o:ole="">
-            <v:imagedata r:id="rId66" o:title=""/>
+          <v:shape id="_x0000_i1055" type="#_x0000_t75" style="width:281.4pt;height:56.4pt" o:ole="">
+            <v:imagedata r:id="rId67" o:title=""/>
           </v:shape>
-          <o:OLEObject Type="Embed" ProgID="Equation.DSMT4" ShapeID="_x0000_i1055" DrawAspect="Content" ObjectID="_1844968390" r:id="rId67"/>
+          <o:OLEObject Type="Embed" ProgID="Equation.DSMT4" ShapeID="_x0000_i1055" DrawAspect="Content" ObjectID="_1852223186" r:id="rId68"/>
         </w:object>
       </w:r>
-    </w:p>
-    <w:p>
-      <w:pPr>
-        <w:rPr>
-          <w:szCs w:val="24"/>
-        </w:rPr>
-      </w:pPr>
     </w:p>
     <w:p>
       <w:pPr>
@@ -1487,10 +1522,10 @@
           <w:szCs w:val="24"/>
         </w:rPr>
         <w:object w:dxaOrig="1440" w:dyaOrig="400" w14:anchorId="71F25B75">
-          <v:shape id="_x0000_i1056" type="#_x0000_t75" style="width:1in;height:20.25pt" o:ole="">
-            <v:imagedata r:id="rId68" o:title=""/>
+          <v:shape id="_x0000_i1056" type="#_x0000_t75" style="width:1in;height:20.4pt" o:ole="">
+            <v:imagedata r:id="rId69" o:title=""/>
           </v:shape>
-          <o:OLEObject Type="Embed" ProgID="Equation.DSMT4" ShapeID="_x0000_i1056" DrawAspect="Content" ObjectID="_1844968391" r:id="rId69"/>
+          <o:OLEObject Type="Embed" ProgID="Equation.DSMT4" ShapeID="_x0000_i1056" DrawAspect="Content" ObjectID="_1852223187" r:id="rId70"/>
         </w:object>
       </w:r>
       <w:r>
@@ -1505,10 +1540,10 @@
           <w:szCs w:val="24"/>
         </w:rPr>
         <w:object w:dxaOrig="1460" w:dyaOrig="400" w14:anchorId="149518E4">
-          <v:shape id="_x0000_i1057" type="#_x0000_t75" style="width:72.8pt;height:20.25pt" o:ole="">
-            <v:imagedata r:id="rId70" o:title=""/>
+          <v:shape id="_x0000_i1057" type="#_x0000_t75" style="width:72.6pt;height:20.4pt" o:ole="">
+            <v:imagedata r:id="rId71" o:title=""/>
           </v:shape>
-          <o:OLEObject Type="Embed" ProgID="Equation.DSMT4" ShapeID="_x0000_i1057" DrawAspect="Content" ObjectID="_1844968392" r:id="rId71"/>
+          <o:OLEObject Type="Embed" ProgID="Equation.DSMT4" ShapeID="_x0000_i1057" DrawAspect="Content" ObjectID="_1852223188" r:id="rId72"/>
         </w:object>
       </w:r>
       <w:r>
@@ -1544,10 +1579,10 @@
           <w:szCs w:val="24"/>
         </w:rPr>
         <w:object w:dxaOrig="1520" w:dyaOrig="400" w14:anchorId="56AA5E7D">
-          <v:shape id="_x0000_i1058" type="#_x0000_t75" style="width:75.75pt;height:20.25pt" o:ole="">
-            <v:imagedata r:id="rId72" o:title=""/>
+          <v:shape id="_x0000_i1058" type="#_x0000_t75" style="width:75.6pt;height:20.4pt" o:ole="">
+            <v:imagedata r:id="rId73" o:title=""/>
           </v:shape>
-          <o:OLEObject Type="Embed" ProgID="Equation.DSMT4" ShapeID="_x0000_i1058" DrawAspect="Content" ObjectID="_1844968393" r:id="rId73"/>
+          <o:OLEObject Type="Embed" ProgID="Equation.DSMT4" ShapeID="_x0000_i1058" DrawAspect="Content" ObjectID="_1852223189" r:id="rId74"/>
         </w:object>
       </w:r>
       <w:r>
@@ -1562,10 +1597,10 @@
           <w:szCs w:val="24"/>
         </w:rPr>
         <w:object w:dxaOrig="1640" w:dyaOrig="400" w14:anchorId="2997F3FA">
-          <v:shape id="_x0000_i1059" type="#_x0000_t75" style="width:81.75pt;height:20.25pt" o:ole="">
-            <v:imagedata r:id="rId74" o:title=""/>
+          <v:shape id="_x0000_i1059" type="#_x0000_t75" style="width:81.6pt;height:20.4pt" o:ole="">
+            <v:imagedata r:id="rId75" o:title=""/>
           </v:shape>
-          <o:OLEObject Type="Embed" ProgID="Equation.DSMT4" ShapeID="_x0000_i1059" DrawAspect="Content" ObjectID="_1844968394" r:id="rId75"/>
+          <o:OLEObject Type="Embed" ProgID="Equation.DSMT4" ShapeID="_x0000_i1059" DrawAspect="Content" ObjectID="_1852223190" r:id="rId76"/>
         </w:object>
       </w:r>
       <w:r>
@@ -1608,10 +1643,10 @@
           <w:szCs w:val="24"/>
         </w:rPr>
         <w:object w:dxaOrig="3120" w:dyaOrig="400" w14:anchorId="6DCAB6A7">
-          <v:shape id="_x0000_i1060" type="#_x0000_t75" style="width:156pt;height:20.25pt" o:ole="">
-            <v:imagedata r:id="rId76" o:title=""/>
+          <v:shape id="_x0000_i1060" type="#_x0000_t75" style="width:156pt;height:20.4pt" o:ole="">
+            <v:imagedata r:id="rId77" o:title=""/>
           </v:shape>
-          <o:OLEObject Type="Embed" ProgID="Equation.DSMT4" ShapeID="_x0000_i1060" DrawAspect="Content" ObjectID="_1844968395" r:id="rId77"/>
+          <o:OLEObject Type="Embed" ProgID="Equation.DSMT4" ShapeID="_x0000_i1060" DrawAspect="Content" ObjectID="_1852223191" r:id="rId78"/>
         </w:object>
       </w:r>
       <w:r>
@@ -1648,10 +1683,10 @@
           <w:szCs w:val="24"/>
         </w:rPr>
         <w:object w:dxaOrig="1120" w:dyaOrig="620" w14:anchorId="23343A68">
-          <v:shape id="_x0000_i1061" type="#_x0000_t75" style="width:56.2pt;height:30.75pt" o:ole="">
-            <v:imagedata r:id="rId78" o:title=""/>
+          <v:shape id="_x0000_i1061" type="#_x0000_t75" style="width:56.4pt;height:30.6pt" o:ole="">
+            <v:imagedata r:id="rId79" o:title=""/>
           </v:shape>
-          <o:OLEObject Type="Embed" ProgID="Equation.DSMT4" ShapeID="_x0000_i1061" DrawAspect="Content" ObjectID="_1844968396" r:id="rId79"/>
+          <o:OLEObject Type="Embed" ProgID="Equation.DSMT4" ShapeID="_x0000_i1061" DrawAspect="Content" ObjectID="_1852223192" r:id="rId80"/>
         </w:object>
       </w:r>
       <w:r>
@@ -1678,20 +1713,6 @@
     <w:p>
       <w:pPr>
         <w:rPr>
-          <w:szCs w:val="24"/>
-        </w:rPr>
-      </w:pPr>
-    </w:p>
-    <w:p>
-      <w:pPr>
-        <w:rPr>
-          <w:szCs w:val="24"/>
-        </w:rPr>
-      </w:pPr>
-    </w:p>
-    <w:p>
-      <w:pPr>
-        <w:rPr>
           <w:b/>
           <w:bCs/>
           <w:szCs w:val="24"/>
@@ -1705,6 +1726,7 @@
           <w:szCs w:val="24"/>
           <w:u w:val="single"/>
         </w:rPr>
+        <w:lastRenderedPageBreak/>
         <w:t>Summary Point</w:t>
       </w:r>
     </w:p>
@@ -1732,10 +1754,10 @@
           <w:position w:val="-48"/>
         </w:rPr>
         <w:object w:dxaOrig="2960" w:dyaOrig="1080" w14:anchorId="6E90CA1A">
-          <v:shape id="_x0000_i1062" type="#_x0000_t75" style="width:146.95pt;height:54.75pt" o:ole="">
-            <v:imagedata r:id="rId80" o:title=""/>
+          <v:shape id="_x0000_i1062" type="#_x0000_t75" style="width:147pt;height:54.6pt" o:ole="">
+            <v:imagedata r:id="rId81" o:title=""/>
           </v:shape>
-          <o:OLEObject Type="Embed" ProgID="Equation.DSMT4" ShapeID="_x0000_i1062" DrawAspect="Content" ObjectID="_1844968397" r:id="rId81"/>
+          <o:OLEObject Type="Embed" ProgID="Equation.DSMT4" ShapeID="_x0000_i1062" DrawAspect="Content" ObjectID="_1852223193" r:id="rId82"/>
         </w:object>
       </w:r>
       <w:r>
@@ -1750,10 +1772,10 @@
           <w:position w:val="-6"/>
         </w:rPr>
         <w:object w:dxaOrig="560" w:dyaOrig="279" w14:anchorId="43A64733">
-          <v:shape id="_x0000_i1063" type="#_x0000_t75" style="width:27.75pt;height:14.25pt" o:ole="">
-            <v:imagedata r:id="rId82" o:title=""/>
+          <v:shape id="_x0000_i1063" type="#_x0000_t75" style="width:27.6pt;height:14.4pt" o:ole="">
+            <v:imagedata r:id="rId83" o:title=""/>
           </v:shape>
-          <o:OLEObject Type="Embed" ProgID="Equation.DSMT4" ShapeID="_x0000_i1063" DrawAspect="Content" ObjectID="_1844968398" r:id="rId83"/>
+          <o:OLEObject Type="Embed" ProgID="Equation.DSMT4" ShapeID="_x0000_i1063" DrawAspect="Content" ObjectID="_1852223194" r:id="rId84"/>
         </w:object>
       </w:r>
       <w:r>
@@ -1818,10 +1840,10 @@
           <w:szCs w:val="24"/>
         </w:rPr>
         <w:object w:dxaOrig="560" w:dyaOrig="220" w14:anchorId="5D063DD3">
-          <v:shape id="_x0000_i1064" type="#_x0000_t75" style="width:27.75pt;height:11.25pt" o:ole="">
-            <v:imagedata r:id="rId84" o:title=""/>
+          <v:shape id="_x0000_i1064" type="#_x0000_t75" style="width:27.6pt;height:11.4pt" o:ole="">
+            <v:imagedata r:id="rId85" o:title=""/>
           </v:shape>
-          <o:OLEObject Type="Embed" ProgID="Equation.DSMT4" ShapeID="_x0000_i1064" DrawAspect="Content" ObjectID="_1844968399" r:id="rId85"/>
+          <o:OLEObject Type="Embed" ProgID="Equation.DSMT4" ShapeID="_x0000_i1064" DrawAspect="Content" ObjectID="_1852223195" r:id="rId86"/>
         </w:object>
       </w:r>
       <w:r>
@@ -1838,10 +1860,10 @@
           <w:szCs w:val="24"/>
         </w:rPr>
         <w:object w:dxaOrig="639" w:dyaOrig="400" w14:anchorId="537EC0BC">
-          <v:shape id="_x0000_i1065" type="#_x0000_t75" style="width:33pt;height:20.25pt" o:ole="">
-            <v:imagedata r:id="rId86" o:title=""/>
+          <v:shape id="_x0000_i1065" type="#_x0000_t75" style="width:33pt;height:20.4pt" o:ole="">
+            <v:imagedata r:id="rId87" o:title=""/>
           </v:shape>
-          <o:OLEObject Type="Embed" ProgID="Equation.DSMT4" ShapeID="_x0000_i1065" DrawAspect="Content" ObjectID="_1844968400" r:id="rId87"/>
+          <o:OLEObject Type="Embed" ProgID="Equation.DSMT4" ShapeID="_x0000_i1065" DrawAspect="Content" ObjectID="_1852223196" r:id="rId88"/>
         </w:object>
       </w:r>
       <w:r>
@@ -1858,10 +1880,10 @@
           <w:szCs w:val="24"/>
         </w:rPr>
         <w:object w:dxaOrig="2020" w:dyaOrig="660" w14:anchorId="40B4DA84">
-          <v:shape id="_x0000_i1066" type="#_x0000_t75" style="width:101.2pt;height:33pt" o:ole="">
-            <v:imagedata r:id="rId88" o:title=""/>
+          <v:shape id="_x0000_i1066" type="#_x0000_t75" style="width:101.4pt;height:33pt" o:ole="">
+            <v:imagedata r:id="rId89" o:title=""/>
           </v:shape>
-          <o:OLEObject Type="Embed" ProgID="Equation.DSMT4" ShapeID="_x0000_i1066" DrawAspect="Content" ObjectID="_1844968401" r:id="rId89"/>
+          <o:OLEObject Type="Embed" ProgID="Equation.DSMT4" ShapeID="_x0000_i1066" DrawAspect="Content" ObjectID="_1852223197" r:id="rId90"/>
         </w:object>
       </w:r>
       <w:r>
@@ -1903,10 +1925,10 @@
           <w:szCs w:val="24"/>
         </w:rPr>
         <w:object w:dxaOrig="580" w:dyaOrig="400" w14:anchorId="752FDB35">
-          <v:shape id="_x0000_i1067" type="#_x0000_t75" style="width:29.25pt;height:20.25pt" o:ole="">
-            <v:imagedata r:id="rId90" o:title=""/>
+          <v:shape id="_x0000_i1067" type="#_x0000_t75" style="width:29.4pt;height:20.4pt" o:ole="">
+            <v:imagedata r:id="rId91" o:title=""/>
           </v:shape>
-          <o:OLEObject Type="Embed" ProgID="Equation.DSMT4" ShapeID="_x0000_i1067" DrawAspect="Content" ObjectID="_1844968402" r:id="rId91"/>
+          <o:OLEObject Type="Embed" ProgID="Equation.DSMT4" ShapeID="_x0000_i1067" DrawAspect="Content" ObjectID="_1852223198" r:id="rId92"/>
         </w:object>
       </w:r>
       <w:r>
@@ -1923,10 +1945,10 @@
           <w:szCs w:val="24"/>
         </w:rPr>
         <w:object w:dxaOrig="560" w:dyaOrig="279" w14:anchorId="47F9779D">
-          <v:shape id="_x0000_i1068" type="#_x0000_t75" style="width:27.75pt;height:14.25pt" o:ole="">
-            <v:imagedata r:id="rId82" o:title=""/>
+          <v:shape id="_x0000_i1068" type="#_x0000_t75" style="width:27.6pt;height:14.4pt" o:ole="">
+            <v:imagedata r:id="rId83" o:title=""/>
           </v:shape>
-          <o:OLEObject Type="Embed" ProgID="Equation.DSMT4" ShapeID="_x0000_i1068" DrawAspect="Content" ObjectID="_1844968403" r:id="rId92"/>
+          <o:OLEObject Type="Embed" ProgID="Equation.DSMT4" ShapeID="_x0000_i1068" DrawAspect="Content" ObjectID="_1852223199" r:id="rId93"/>
         </w:object>
       </w:r>
       <w:r>
@@ -1943,10 +1965,10 @@
           <w:szCs w:val="24"/>
         </w:rPr>
         <w:object w:dxaOrig="2000" w:dyaOrig="660" w14:anchorId="486EA983">
-          <v:shape id="_x0000_i1069" type="#_x0000_t75" style="width:99.8pt;height:33pt" o:ole="">
-            <v:imagedata r:id="rId93" o:title=""/>
+          <v:shape id="_x0000_i1069" type="#_x0000_t75" style="width:99.6pt;height:33pt" o:ole="">
+            <v:imagedata r:id="rId94" o:title=""/>
           </v:shape>
-          <o:OLEObject Type="Embed" ProgID="Equation.DSMT4" ShapeID="_x0000_i1069" DrawAspect="Content" ObjectID="_1844968404" r:id="rId94"/>
+          <o:OLEObject Type="Embed" ProgID="Equation.DSMT4" ShapeID="_x0000_i1069" DrawAspect="Content" ObjectID="_1852223200" r:id="rId95"/>
         </w:object>
       </w:r>
       <w:r>
@@ -1988,10 +2010,10 @@
           <w:szCs w:val="24"/>
         </w:rPr>
         <w:object w:dxaOrig="7720" w:dyaOrig="999" w14:anchorId="5869DA82">
-          <v:shape id="_x0000_i1070" type="#_x0000_t75" style="width:387.15pt;height:50.25pt" o:ole="">
-            <v:imagedata r:id="rId95" o:title=""/>
+          <v:shape id="_x0000_i1070" type="#_x0000_t75" style="width:387pt;height:50.4pt" o:ole="">
+            <v:imagedata r:id="rId96" o:title=""/>
           </v:shape>
-          <o:OLEObject Type="Embed" ProgID="Equation.DSMT4" ShapeID="_x0000_i1070" DrawAspect="Content" ObjectID="_1844968405" r:id="rId96"/>
+          <o:OLEObject Type="Embed" ProgID="Equation.DSMT4" ShapeID="_x0000_i1070" DrawAspect="Content" ObjectID="_1852223201" r:id="rId97"/>
         </w:object>
       </w:r>
       <w:r>
@@ -2049,10 +2071,10 @@
           <w:szCs w:val="24"/>
         </w:rPr>
         <w:object w:dxaOrig="1600" w:dyaOrig="680" w14:anchorId="6FF097D9">
-          <v:shape id="_x0000_i1071" type="#_x0000_t75" style="width:80.25pt;height:33pt" o:ole="">
-            <v:imagedata r:id="rId97" o:title=""/>
+          <v:shape id="_x0000_i1071" type="#_x0000_t75" style="width:80.4pt;height:33pt" o:ole="">
+            <v:imagedata r:id="rId98" o:title=""/>
           </v:shape>
-          <o:OLEObject Type="Embed" ProgID="Equation.DSMT4" ShapeID="_x0000_i1071" DrawAspect="Content" ObjectID="_1844968406" r:id="rId98"/>
+          <o:OLEObject Type="Embed" ProgID="Equation.DSMT4" ShapeID="_x0000_i1071" DrawAspect="Content" ObjectID="_1852223202" r:id="rId99"/>
         </w:object>
       </w:r>
       <w:r>
@@ -2086,10 +2108,10 @@
           <w:szCs w:val="24"/>
         </w:rPr>
         <w:object w:dxaOrig="2799" w:dyaOrig="680" w14:anchorId="7BFE4BE0">
-          <v:shape id="_x0000_i1072" type="#_x0000_t75" style="width:139.55pt;height:33pt" o:ole="">
-            <v:imagedata r:id="rId99" o:title=""/>
+          <v:shape id="_x0000_i1072" type="#_x0000_t75" style="width:139.8pt;height:33pt" o:ole="">
+            <v:imagedata r:id="rId100" o:title=""/>
           </v:shape>
-          <o:OLEObject Type="Embed" ProgID="Equation.DSMT4" ShapeID="_x0000_i1072" DrawAspect="Content" ObjectID="_1844968407" r:id="rId100"/>
+          <o:OLEObject Type="Embed" ProgID="Equation.DSMT4" ShapeID="_x0000_i1072" DrawAspect="Content" ObjectID="_1852223203" r:id="rId101"/>
         </w:object>
       </w:r>
       <w:r>
@@ -2123,10 +2145,10 @@
           <w:szCs w:val="24"/>
         </w:rPr>
         <w:object w:dxaOrig="2780" w:dyaOrig="680" w14:anchorId="65B1CDE1">
-          <v:shape id="_x0000_i1073" type="#_x0000_t75" style="width:139.55pt;height:33pt" o:ole="">
-            <v:imagedata r:id="rId101" o:title=""/>
+          <v:shape id="_x0000_i1073" type="#_x0000_t75" style="width:139.8pt;height:33pt" o:ole="">
+            <v:imagedata r:id="rId102" o:title=""/>
           </v:shape>
-          <o:OLEObject Type="Embed" ProgID="Equation.DSMT4" ShapeID="_x0000_i1073" DrawAspect="Content" ObjectID="_1844968408" r:id="rId102"/>
+          <o:OLEObject Type="Embed" ProgID="Equation.DSMT4" ShapeID="_x0000_i1073" DrawAspect="Content" ObjectID="_1852223204" r:id="rId103"/>
         </w:object>
       </w:r>
       <w:r>
@@ -2168,10 +2190,10 @@
           <w:szCs w:val="24"/>
         </w:rPr>
         <w:object w:dxaOrig="2560" w:dyaOrig="460" w14:anchorId="7134142A">
-          <v:shape id="_x0000_i1074" type="#_x0000_t75" style="width:128.25pt;height:23.25pt" o:ole="">
-            <v:imagedata r:id="rId103" o:title=""/>
+          <v:shape id="_x0000_i1074" type="#_x0000_t75" style="width:128.4pt;height:23.4pt" o:ole="">
+            <v:imagedata r:id="rId104" o:title=""/>
           </v:shape>
-          <o:OLEObject Type="Embed" ProgID="Equation.DSMT4" ShapeID="_x0000_i1074" DrawAspect="Content" ObjectID="_1844968409" r:id="rId104"/>
+          <o:OLEObject Type="Embed" ProgID="Equation.DSMT4" ShapeID="_x0000_i1074" DrawAspect="Content" ObjectID="_1852223205" r:id="rId105"/>
         </w:object>
       </w:r>
       <w:r>
@@ -2188,10 +2210,10 @@
           <w:szCs w:val="24"/>
         </w:rPr>
         <w:object w:dxaOrig="1680" w:dyaOrig="680" w14:anchorId="75F690E1">
-          <v:shape id="_x0000_i1075" type="#_x0000_t75" style="width:83.25pt;height:33pt" o:ole="">
-            <v:imagedata r:id="rId105" o:title=""/>
+          <v:shape id="_x0000_i1075" type="#_x0000_t75" style="width:83.4pt;height:33pt" o:ole="">
+            <v:imagedata r:id="rId106" o:title=""/>
           </v:shape>
-          <o:OLEObject Type="Embed" ProgID="Equation.DSMT4" ShapeID="_x0000_i1075" DrawAspect="Content" ObjectID="_1844968410" r:id="rId106"/>
+          <o:OLEObject Type="Embed" ProgID="Equation.DSMT4" ShapeID="_x0000_i1075" DrawAspect="Content" ObjectID="_1852223206" r:id="rId107"/>
         </w:object>
       </w:r>
       <w:r>
@@ -2208,10 +2230,10 @@
           <w:szCs w:val="24"/>
         </w:rPr>
         <w:object w:dxaOrig="2360" w:dyaOrig="660" w14:anchorId="0F21113C">
-          <v:shape id="_x0000_i1076" type="#_x0000_t75" style="width:117.75pt;height:33pt" o:ole="">
-            <v:imagedata r:id="rId107" o:title=""/>
+          <v:shape id="_x0000_i1076" type="#_x0000_t75" style="width:117.6pt;height:33pt" o:ole="">
+            <v:imagedata r:id="rId108" o:title=""/>
           </v:shape>
-          <o:OLEObject Type="Embed" ProgID="Equation.DSMT4" ShapeID="_x0000_i1076" DrawAspect="Content" ObjectID="_1844968411" r:id="rId108"/>
+          <o:OLEObject Type="Embed" ProgID="Equation.DSMT4" ShapeID="_x0000_i1076" DrawAspect="Content" ObjectID="_1852223207" r:id="rId109"/>
         </w:object>
       </w:r>
       <w:r>
@@ -2228,10 +2250,10 @@
           <w:szCs w:val="24"/>
         </w:rPr>
         <w:object w:dxaOrig="580" w:dyaOrig="400" w14:anchorId="029EEA44">
-          <v:shape id="_x0000_i1077" type="#_x0000_t75" style="width:29.25pt;height:20.25pt" o:ole="">
-            <v:imagedata r:id="rId109" o:title=""/>
+          <v:shape id="_x0000_i1077" type="#_x0000_t75" style="width:29.4pt;height:20.4pt" o:ole="">
+            <v:imagedata r:id="rId110" o:title=""/>
           </v:shape>
-          <o:OLEObject Type="Embed" ProgID="Equation.DSMT4" ShapeID="_x0000_i1077" DrawAspect="Content" ObjectID="_1844968412" r:id="rId110"/>
+          <o:OLEObject Type="Embed" ProgID="Equation.DSMT4" ShapeID="_x0000_i1077" DrawAspect="Content" ObjectID="_1852223208" r:id="rId111"/>
         </w:object>
       </w:r>
       <w:r>
@@ -2248,10 +2270,10 @@
           <w:szCs w:val="24"/>
         </w:rPr>
         <w:object w:dxaOrig="560" w:dyaOrig="279" w14:anchorId="258DE069">
-          <v:shape id="_x0000_i1078" type="#_x0000_t75" style="width:27.75pt;height:14.25pt" o:ole="">
-            <v:imagedata r:id="rId82" o:title=""/>
+          <v:shape id="_x0000_i1078" type="#_x0000_t75" style="width:27.6pt;height:14.4pt" o:ole="">
+            <v:imagedata r:id="rId83" o:title=""/>
           </v:shape>
-          <o:OLEObject Type="Embed" ProgID="Equation.DSMT4" ShapeID="_x0000_i1078" DrawAspect="Content" ObjectID="_1844968413" r:id="rId111"/>
+          <o:OLEObject Type="Embed" ProgID="Equation.DSMT4" ShapeID="_x0000_i1078" DrawAspect="Content" ObjectID="_1852223209" r:id="rId112"/>
         </w:object>
       </w:r>
       <w:r>
@@ -2368,12 +2390,12 @@
       </w:pPr>
     </w:p>
     <w:sectPr>
-      <w:headerReference w:type="even" r:id="rId112"/>
-      <w:headerReference w:type="default" r:id="rId113"/>
-      <w:footerReference w:type="even" r:id="rId114"/>
-      <w:footerReference w:type="default" r:id="rId115"/>
-      <w:headerReference w:type="first" r:id="rId116"/>
-      <w:footerReference w:type="first" r:id="rId117"/>
+      <w:headerReference w:type="even" r:id="rId113"/>
+      <w:headerReference w:type="default" r:id="rId114"/>
+      <w:footerReference w:type="even" r:id="rId115"/>
+      <w:footerReference w:type="default" r:id="rId116"/>
+      <w:headerReference w:type="first" r:id="rId117"/>
+      <w:footerReference w:type="first" r:id="rId118"/>
       <w:pgSz w:w="12240" w:h="15840"/>
       <w:pgMar w:top="720" w:right="720" w:bottom="720" w:left="720" w:header="576" w:footer="720" w:gutter="0"/>
       <w:cols w:space="720"/>

</xml_diff>